<commit_message>
fix(Task #651395): improve transcript scoring reliability
- Improve guide retrieval for frontend questions and spoken API names
- Retry missing citations and misquoted transcript evidence
- Exclude generic introductions from scoring
- Preserve validated scores when retrying failed answers
- Update scoring fixtures, documentation, and regression tests
</commit_message>
<xml_diff>
--- a/docs/HireSense_Software_Requirements_Specification.docx
+++ b/docs/HireSense_Software_Requirements_Specification.docx
@@ -122,11 +122,11 @@
         </w:tblCellMar>
       </w:tblPr>
       <w:tblGrid>
-        <w:gridCol w:w="864"/>
-        <w:gridCol w:w="1339"/>
-        <w:gridCol w:w="1512"/>
-        <w:gridCol w:w="1512"/>
-        <w:gridCol w:w="4133"/>
+        <w:gridCol w:w="870"/>
+        <w:gridCol w:w="1335"/>
+        <w:gridCol w:w="1515"/>
+        <w:gridCol w:w="1515"/>
+        <w:gridCol w:w="4140"/>
       </w:tblGrid>
       <w:tr>
         <w:trPr>
@@ -135,13 +135,12 @@
         </w:trPr>
         <w:tc>
           <w:tcPr>
-            <w:tcW w:type="dxa" w:w="864"/>
-            <w:vAlign w:val="center"/>
-            <w:shd w:fill="EEEEEE" w:val="clear"/>
-          </w:tcPr>
-          <w:p>
-            <w:pPr>
-              <w:pStyle w:val="TableText"/>
+            <w:tcW w:w="870" w:type="dxa"/>
+            <w:vAlign w:val="center"/>
+            <w:shd w:val="clear" w:color="auto" w:fill="EEEEEE"/>
+          </w:tcPr>
+          <w:p>
+            <w:pPr>
               <w:keepNext w:val="0"/>
               <w:jc w:val="center"/>
             </w:pPr>
@@ -149,83 +148,79 @@
               <w:rPr>
                 <w:b/>
               </w:rPr>
-              <w:t>Doc Ver</w:t>
-            </w:r>
-          </w:p>
-        </w:tc>
-        <w:tc>
-          <w:tcPr>
-            <w:tcW w:type="dxa" w:w="1339"/>
-            <w:vAlign w:val="center"/>
-            <w:shd w:fill="EEEEEE" w:val="clear"/>
-          </w:tcPr>
-          <w:p>
-            <w:pPr>
-              <w:pStyle w:val="TableText"/>
+              <w:t xml:space="preserve">Doc Ver</w:t>
+            </w:r>
+          </w:p>
+        </w:tc>
+        <w:tc>
+          <w:tcPr>
+            <w:tcW w:w="1335" w:type="dxa"/>
+            <w:vAlign w:val="center"/>
+            <w:shd w:val="clear" w:color="auto" w:fill="EEEEEE"/>
+          </w:tcPr>
+          <w:p>
+            <w:pPr>
               <w:keepNext w:val="0"/>
             </w:pPr>
             <w:r>
               <w:rPr>
                 <w:b/>
               </w:rPr>
-              <w:t>Date</w:t>
-            </w:r>
-          </w:p>
-        </w:tc>
-        <w:tc>
-          <w:tcPr>
-            <w:tcW w:type="dxa" w:w="1512"/>
-            <w:vAlign w:val="center"/>
-            <w:shd w:fill="EEEEEE" w:val="clear"/>
-          </w:tcPr>
-          <w:p>
-            <w:pPr>
-              <w:pStyle w:val="TableText"/>
+              <w:t xml:space="preserve">Date</w:t>
+            </w:r>
+          </w:p>
+        </w:tc>
+        <w:tc>
+          <w:tcPr>
+            <w:tcW w:w="1515" w:type="dxa"/>
+            <w:vAlign w:val="center"/>
+            <w:shd w:val="clear" w:color="auto" w:fill="EEEEEE"/>
+          </w:tcPr>
+          <w:p>
+            <w:pPr>
               <w:keepNext w:val="0"/>
             </w:pPr>
             <w:r>
               <w:rPr>
                 <w:b/>
               </w:rPr>
-              <w:t>Author</w:t>
-            </w:r>
-          </w:p>
-        </w:tc>
-        <w:tc>
-          <w:tcPr>
-            <w:tcW w:type="dxa" w:w="1512"/>
-            <w:vAlign w:val="center"/>
-            <w:shd w:fill="EEEEEE" w:val="clear"/>
-          </w:tcPr>
-          <w:p>
-            <w:pPr>
-              <w:pStyle w:val="TableText"/>
+              <w:t xml:space="preserve">Author</w:t>
+            </w:r>
+          </w:p>
+        </w:tc>
+        <w:tc>
+          <w:tcPr>
+            <w:tcW w:w="1515" w:type="dxa"/>
+            <w:vAlign w:val="center"/>
+            <w:shd w:val="clear" w:color="auto" w:fill="EEEEEE"/>
+          </w:tcPr>
+          <w:p>
+            <w:pPr>
               <w:keepNext w:val="0"/>
             </w:pPr>
             <w:r>
               <w:rPr>
                 <w:b/>
               </w:rPr>
-              <w:t>Reviewer</w:t>
-            </w:r>
-          </w:p>
-        </w:tc>
-        <w:tc>
-          <w:tcPr>
-            <w:tcW w:type="dxa" w:w="4133"/>
-            <w:vAlign w:val="center"/>
-            <w:shd w:fill="EEEEEE" w:val="clear"/>
-          </w:tcPr>
-          <w:p>
-            <w:pPr>
-              <w:pStyle w:val="TableText"/>
+              <w:t xml:space="preserve">Reviewer</w:t>
+            </w:r>
+          </w:p>
+        </w:tc>
+        <w:tc>
+          <w:tcPr>
+            <w:tcW w:w="4140" w:type="dxa"/>
+            <w:vAlign w:val="center"/>
+            <w:shd w:val="clear" w:color="auto" w:fill="EEEEEE"/>
+          </w:tcPr>
+          <w:p>
+            <w:pPr>
               <w:keepNext w:val="0"/>
             </w:pPr>
             <w:r>
               <w:rPr>
                 <w:b/>
               </w:rPr>
-              <w:t>Description of revision</w:t>
+              <w:t xml:space="preserve">Description of revision</w:t>
             </w:r>
           </w:p>
         </w:tc>
@@ -236,73 +231,69 @@
         </w:trPr>
         <w:tc>
           <w:tcPr>
-            <w:tcW w:type="dxa" w:w="864"/>
-            <w:vAlign w:val="center"/>
-          </w:tcPr>
-          <w:p>
-            <w:pPr>
-              <w:pStyle w:val="TableText"/>
+            <w:tcW w:w="870" w:type="dxa"/>
+            <w:vAlign w:val="center"/>
+          </w:tcPr>
+          <w:p>
+            <w:pPr>
               <w:keepNext w:val="0"/>
               <w:jc w:val="center"/>
             </w:pPr>
             <w:r>
-              <w:t>1.0</w:t>
-            </w:r>
-          </w:p>
-        </w:tc>
-        <w:tc>
-          <w:tcPr>
-            <w:tcW w:type="dxa" w:w="1339"/>
-            <w:vAlign w:val="center"/>
-          </w:tcPr>
-          <w:p>
-            <w:pPr>
-              <w:pStyle w:val="TableText"/>
-              <w:keepNext w:val="0"/>
-            </w:pPr>
-            <w:r>
-              <w:t>27 Oct 2026</w:t>
-            </w:r>
-          </w:p>
-        </w:tc>
-        <w:tc>
-          <w:tcPr>
-            <w:tcW w:type="dxa" w:w="1512"/>
-            <w:vAlign w:val="center"/>
-          </w:tcPr>
-          <w:p>
-            <w:pPr>
-              <w:pStyle w:val="TableText"/>
-              <w:keepNext w:val="0"/>
-            </w:pPr>
-            <w:r/>
-          </w:p>
-        </w:tc>
-        <w:tc>
-          <w:tcPr>
-            <w:tcW w:type="dxa" w:w="1512"/>
-            <w:vAlign w:val="center"/>
-          </w:tcPr>
-          <w:p>
-            <w:pPr>
-              <w:pStyle w:val="TableText"/>
-              <w:keepNext w:val="0"/>
-            </w:pPr>
-            <w:r/>
-          </w:p>
-        </w:tc>
-        <w:tc>
-          <w:tcPr>
-            <w:tcW w:type="dxa" w:w="4133"/>
-            <w:vAlign w:val="center"/>
-          </w:tcPr>
-          <w:p>
-            <w:pPr>
-              <w:pStyle w:val="TableText"/>
-              <w:keepNext w:val="0"/>
-            </w:pPr>
-            <w:r>
-              <w:t>Initial full-project SRS prepared for review.</w:t>
+              <w:t xml:space="preserve">1.0</w:t>
+            </w:r>
+          </w:p>
+        </w:tc>
+        <w:tc>
+          <w:tcPr>
+            <w:tcW w:w="1335" w:type="dxa"/>
+            <w:vAlign w:val="center"/>
+          </w:tcPr>
+          <w:p>
+            <w:pPr>
+              <w:keepNext w:val="0"/>
+            </w:pPr>
+            <w:r>
+              <w:t xml:space="preserve">27 Oct 2026</w:t>
+            </w:r>
+          </w:p>
+        </w:tc>
+        <w:tc>
+          <w:tcPr>
+            <w:tcW w:w="1515" w:type="dxa"/>
+            <w:vAlign w:val="center"/>
+          </w:tcPr>
+          <w:p>
+            <w:pPr>
+              <w:keepNext w:val="0"/>
+            </w:pPr>
+            <w:r>
+              <w:t xml:space="preserve">Sohail Ahmed</w:t>
+            </w:r>
+          </w:p>
+        </w:tc>
+        <w:tc>
+          <w:tcPr>
+            <w:tcW w:w="1515" w:type="dxa"/>
+            <w:vAlign w:val="center"/>
+          </w:tcPr>
+          <w:p>
+            <w:pPr>
+              <w:keepNext w:val="0"/>
+            </w:pPr>
+          </w:p>
+        </w:tc>
+        <w:tc>
+          <w:tcPr>
+            <w:tcW w:w="4140" w:type="dxa"/>
+            <w:vAlign w:val="center"/>
+          </w:tcPr>
+          <w:p>
+            <w:pPr>
+              <w:keepNext w:val="0"/>
+            </w:pPr>
+            <w:r>
+              <w:t xml:space="preserve">Initial full-project SRS prepared for review.</w:t>
             </w:r>
           </w:p>
         </w:tc>

</xml_diff>